<commit_message>
Rent index answer checked against Dubai Decree 43/2013 (source on page 07), B05 creative from 15.10 table, refreshed PDFs and Word
Co-Authored-By: Claude Opus 5.5 (1M context) <noreply@anthropic.com>
</commit_message>
<xml_diff>
--- a/map/NEMAX-Dubai-Yield-Map-v3-BROKER-for-review-2026-10-15.docx
+++ b/map/NEMAX-Dubai-Yield-Map-v3-BROKER-for-review-2026-10-15.docx
@@ -3782,7 +3782,7 @@
           <w:sz w:val="18"/>
           <w:szCs w:val="18"/>
         </w:rPr>
-        <w:t xml:space="preserve">Note: no figure is quoted on this page. The April 2026 split between new tenancies and renewals is no longer published.</w:t>
+        <w:t xml:space="preserve">Source: Dubai Decree No. 43 of 2013, Articles 1 and 3: the maximum rent increase at renewal is set by the RERA rental index.</w:t>
       </w:r>
     </w:p>
     <w:p>
@@ -4393,7 +4393,7 @@
           <w:iCs/>
           <w:color w:val="C00000"/>
         </w:rPr>
-        <w:t xml:space="preserve">Вопрос с Reddit: больше десятка тредов про индекс аренды при продлении, последний 13.10.2026. Первоисточник правил индекса (RERA) в ресёче не открыт: проверить перед выпуском.</w:t>
+        <w:t xml:space="preserve">Вопрос с Reddit: больше десятка тредов про индекс аренды при продлении, последний 13.10.2026. Ответ проверен 15.10 по Указу Дубая № 43 от 2013 года (ст. 1 и 3).</w:t>
       </w:r>
     </w:p>
     <w:p>

</xml_diff>